<commit_message>
Changed directory + updated data list
</commit_message>
<xml_diff>
--- a/Literature Review/Summary/ParadigmFocus.docx
+++ b/Literature Review/Summary/ParadigmFocus.docx
@@ -4,15 +4,7 @@
   <w:body>
     <w:p>
       <w:r>
-        <w:t xml:space="preserve">I’m writing this note to understand and adjust my research according to the directions provided by </w:t>
-      </w:r>
-      <w:proofErr w:type="spellStart"/>
-      <w:r>
-        <w:t>Maraun</w:t>
-      </w:r>
-      <w:proofErr w:type="spellEnd"/>
-      <w:r>
-        <w:t xml:space="preserve"> (2016):</w:t>
+        <w:t>I’m writing this note to understand and adjust research according to the directions provided by Maraun (2016):</w:t>
       </w:r>
     </w:p>
     <w:p>
@@ -90,10 +82,7 @@
         <w:t>Clear articulation of limitations</w:t>
       </w:r>
       <w:r>
-        <w:t xml:space="preserve"> and assumptions underlying bias-corrected products, avoiding overconfidence in result</w:t>
-      </w:r>
-      <w:r>
-        <w:t>s</w:t>
+        <w:t xml:space="preserve"> and assumptions underlying bias-corrected products, avoiding overconfidence in results</w:t>
       </w:r>
     </w:p>
     <w:p>
@@ -861,6 +850,7 @@
   <w:style w:type="character" w:default="1" w:styleId="DefaultParagraphFont">
     <w:name w:val="Default Paragraph Font"/>
     <w:uiPriority w:val="1"/>
+    <w:semiHidden/>
     <w:unhideWhenUsed/>
   </w:style>
   <w:style w:type="table" w:default="1" w:styleId="TableNormal">

</xml_diff>